<commit_message>
Box sync: reviewer-friendly folder names; folder column in review sheet
- Sync S3 into a local mirror outside Box, then copy into Box with
  reviewer folder names (so aws s3 sync never re-downloads renamed folders):
  - event folders: HTF<id>_<yyyymmdd>, or _1/_2 … in time order when a
    point has several events that day;
  - camera folders numbered per event (1 = nearest), fixed once given.
  Existing Box folders are renamed in place.
- Review sheet: column C shows the camera folder name (linked); Event ID
  shows the event folder name; rows of one event share a shading; the
  original event_id is kept in a hidden column so answers survive renames.
  The workbook is also rebuilt when folder names or columns change.
- maps.py finds numbered camera folders.
- README and reviewer guides (Markdown and Word) describe the new names,
  the mirror, and the Homebrew-Python venv the sync app now uses.

Co-Authored-By: Claude Opus 5.5 <noreply@anthropic.com>
</commit_message>
<xml_diff>
--- a/docs/Reviewer_Guide.docx
+++ b/docs/Reviewer_Guide.docx
@@ -226,7 +226,7 @@
                 <w:sz w:val="18"/>
                 <w:szCs w:val="18"/>
               </w:rPr>
-              <w:t xml:space="preserve">TWL_CrossValidation_captures/</w:t>
+              <w:t>TWL_CrossValidation_captures/</w:t>
             </w:r>
           </w:p>
           <w:p>
@@ -239,7 +239,7 @@
                 <w:sz w:val="18"/>
                 <w:szCs w:val="18"/>
               </w:rPr>
-              <w:t xml:space="preserve">├── HTF_camera_review.xlsx      ← the only file you edit</w:t>
+              <w:t>├── HTF_camera_review.xlsx      ← the only file you edit</w:t>
             </w:r>
           </w:p>
           <w:p>
@@ -252,7 +252,7 @@
                 <w:sz w:val="18"/>
                 <w:szCs w:val="18"/>
               </w:rPr>
-              <w:t xml:space="preserve">├── Reviewer_Guide.docx         ← this guide</w:t>
+              <w:t>├── Reviewer_Guide.docx         ← this guide</w:t>
             </w:r>
           </w:p>
           <w:p>
@@ -265,7 +265,7 @@
                 <w:sz w:val="18"/>
                 <w:szCs w:val="18"/>
               </w:rPr>
-              <w:t xml:space="preserve">├── 2026-09-24/                 ← one folder per date</w:t>
+              <w:t>├── 2026-09-24/                 ← one folder per date</w:t>
             </w:r>
           </w:p>
           <w:p>
@@ -278,7 +278,7 @@
                 <w:sz w:val="18"/>
                 <w:szCs w:val="18"/>
               </w:rPr>
-              <w:t xml:space="preserve">│   └── 20260924T22Z_HTF1071_exceedance/     ← one folder per event</w:t>
+              <w:t>│   └── HTF1071_20260924/                    ← one folder per event (HTF ID + date)</w:t>
             </w:r>
           </w:p>
           <w:p>
@@ -291,7 +291,7 @@
                 <w:sz w:val="18"/>
                 <w:szCs w:val="18"/>
               </w:rPr>
-              <w:t xml:space="preserve">│       ├── event.json                        ← technical details (ignore)</w:t>
+              <w:t>│       ├── event.json                        ← technical details (ignore)</w:t>
             </w:r>
           </w:p>
           <w:p>
@@ -304,7 +304,7 @@
                 <w:sz w:val="18"/>
                 <w:szCs w:val="18"/>
               </w:rPr>
-              <w:t xml:space="preserve">│       ├── traffic_VA-cam-2853/              ← one folder per camera</w:t>
+              <w:t>│       ├── 1_traffic_VA-cam-2853/            ← one folder per camera, numbered 1, 2, 3 …</w:t>
             </w:r>
           </w:p>
           <w:p>
@@ -317,7 +317,7 @@
                 <w:sz w:val="18"/>
                 <w:szCs w:val="18"/>
               </w:rPr>
-              <w:t xml:space="preserve">│       │   ├── map.png                       ← map + forecast chart</w:t>
+              <w:t>│       │   ├── map.png                       ← map + forecast chart</w:t>
             </w:r>
           </w:p>
           <w:p>
@@ -330,7 +330,7 @@
                 <w:sz w:val="18"/>
                 <w:szCs w:val="18"/>
               </w:rPr>
-              <w:t xml:space="preserve">│       │   ├── 2026-09-24T21-30Z.jpg         ← photos, named by UTC time</w:t>
+              <w:t>│       │   ├── 2026-09-24T21-30Z.jpg         ← photos, named by UTC time</w:t>
             </w:r>
           </w:p>
           <w:p>
@@ -343,7 +343,7 @@
                 <w:sz w:val="18"/>
                 <w:szCs w:val="18"/>
               </w:rPr>
-              <w:t xml:space="preserve">│       │   └── 2026-09-24T21-45Z.jpg</w:t>
+              <w:t>│       │   └── 2026-09-24T21-45Z.jpg</w:t>
             </w:r>
           </w:p>
           <w:p>
@@ -356,7 +356,7 @@
                 <w:sz w:val="18"/>
                 <w:szCs w:val="18"/>
               </w:rPr>
-              <w:t xml:space="preserve">│       └── windy_1744113729/</w:t>
+              <w:t>│       └── 2_windy_1744113729/</w:t>
             </w:r>
           </w:p>
           <w:p>
@@ -369,7 +369,7 @@
                 <w:sz w:val="18"/>
                 <w:szCs w:val="18"/>
               </w:rPr>
-              <w:t xml:space="preserve">└── 2026-09-25/</w:t>
+              <w:t>└── 2026-09-25/</w:t>
             </w:r>
           </w:p>
         </w:tc>
@@ -810,7 +810,7 @@
                 <w:sz w:val="20"/>
                 <w:szCs w:val="20"/>
               </w:rPr>
-              <w:t xml:space="preserve">20260924T22Z_HTF1071_exceedance</w:t>
+              <w:t>HTF1071_20260924</w:t>
             </w:r>
             <w:r>
               <w:rPr>
@@ -1418,6 +1418,14 @@
                 <w:bCs/>
               </w:rPr>
               <w:t xml:space="preserve">Click to open this camera's photos</w:t>
+            </w:r>
+            <w:r>
+              <w:rPr>
+                <w:rFonts w:ascii="Arial" w:cs="Arial" w:eastAsia="Arial" w:hAnsi="Arial"/>
+                <w:b/>
+                <w:bCs/>
+              </w:rPr>
+              <w:t xml:space="preserve"> (column C). It shows the camera folder name exactly as in Finder, e.g. 1_traffic_VA-cam-2853.</w:t>
             </w:r>
           </w:p>
         </w:tc>
@@ -1711,7 +1719,13 @@
         <w:rPr>
           <w:rFonts w:ascii="Arial" w:cs="Arial" w:eastAsia="Arial" w:hAnsi="Arial"/>
         </w:rPr>
-        <w:t xml:space="preserve"> and open the photos. Photo names are in </w:t>
+        <w:t xml:space="preserve"> (column C of the Excel file). The link text is the camera folder name exactly as in Finder, e.g. 1_windy_1651853027: camera folders are numbered 1, 2, 3 … in each event (1 = nearest camera). Without the link, the folder is &lt;date&gt;/&lt;Event ID&gt;/&lt;Image folder&gt;, e.g. 2026-10-06/HTF0901_20261006/1_windy_1651853027. Event folders are the HTF ID and date; if one HTF point has two events that day (two high tides), they end in _1 and _2 in time order. Rows of the same event share a shading.</w:t>
+      </w:r>
+      <w:r>
+        <w:rPr>
+          <w:rFonts w:ascii="Arial" w:cs="Arial" w:eastAsia="Arial" w:hAnsi="Arial"/>
+        </w:rPr>
+        <w:t xml:space="preserve"> Then open the photos. Photo names are in </w:t>
       </w:r>
       <w:r>
         <w:rPr>

</xml_diff>

<commit_message>
Review sheet: never lose reviewers' answers on the hourly rebuild
- Refuse to write (and log why) if the Review sheet or a needed header
  is missing/renamed, instead of rebuilding with no answers.
- Keep answered rows whose camera folder is gone, at the bottom, marked
  "(folder not found)".
- Build the new file outside Box, check every earlier answer and note is
  in it, back up the old file (review_backups/, last 300), then replace.
- Skip the hour if the workbook was saved in the last 30 minutes, since
  other reviewers' Excel locks are not visible through Box.
- README and reviewer guides (Markdown and Word) explain the rules.

Co-Authored-By: Claude Opus 5.5 <noreply@anthropic.com>
</commit_message>
<xml_diff>
--- a/docs/Reviewer_Guide.docx
+++ b/docs/Reviewer_Guide.docx
@@ -2943,6 +2943,78 @@
           <w:rFonts w:ascii="Arial" w:cs="Arial" w:eastAsia="Arial" w:hAnsi="Arial"/>
         </w:rPr>
         <w:t xml:space="preserve"> to see only the rows you still need to do.</w:t>
+      </w:r>
+    </w:p>
+    <w:p>
+      <w:pPr>
+        <w:pStyle w:val="ListParagraph"/>
+        <w:numPr>
+          <w:ilvl w:val="0"/>
+          <w:numId w:val="2"/>
+        </w:numPr>
+        <w:spacing w:after="60"/>
+      </w:pPr>
+      <w:r>
+        <w:rPr>
+          <w:rFonts w:ascii="Arial" w:cs="Arial" w:eastAsia="Arial" w:hAnsi="Arial"/>
+          <w:b/>
+          <w:bCs/>
+        </w:rPr>
+        <w:t>Do not rename the column headers, add columns or delete rows.</w:t>
+      </w:r>
+      <w:r>
+        <w:rPr>
+          <w:rFonts w:ascii="Arial" w:cs="Arial" w:eastAsia="Arial" w:hAnsi="Arial"/>
+        </w:rPr>
+        <w:t xml:space="preserve"> The hourly update copies your answers into a freshly built file by matching each row's event and camera. It will not update the file at all if a header has been renamed, and anything typed outside the two yellow columns is not kept.</w:t>
+      </w:r>
+    </w:p>
+    <w:p>
+      <w:pPr>
+        <w:pStyle w:val="ListParagraph"/>
+        <w:numPr>
+          <w:ilvl w:val="0"/>
+          <w:numId w:val="2"/>
+        </w:numPr>
+        <w:spacing w:after="60"/>
+      </w:pPr>
+      <w:r>
+        <w:rPr>
+          <w:rFonts w:ascii="Arial" w:cs="Arial" w:eastAsia="Arial" w:hAnsi="Arial"/>
+          <w:b/>
+          <w:bCs/>
+        </w:rPr>
+        <w:t>The update waits while people are working:</w:t>
+      </w:r>
+      <w:r>
+        <w:rPr>
+          <w:rFonts w:ascii="Arial" w:cs="Arial" w:eastAsia="Arial" w:hAnsi="Arial"/>
+        </w:rPr>
+        <w:t xml:space="preserve"> it skips any hour in which the file was saved during the last 30 minutes.</w:t>
+      </w:r>
+    </w:p>
+    <w:p>
+      <w:pPr>
+        <w:pStyle w:val="ListParagraph"/>
+        <w:numPr>
+          <w:ilvl w:val="0"/>
+          <w:numId w:val="2"/>
+        </w:numPr>
+        <w:spacing w:after="60"/>
+      </w:pPr>
+      <w:r>
+        <w:rPr>
+          <w:rFonts w:ascii="Arial" w:cs="Arial" w:eastAsia="Arial" w:hAnsi="Arial"/>
+          <w:b/>
+          <w:bCs/>
+        </w:rPr>
+        <w:t>Mistakes can be undone:</w:t>
+      </w:r>
+      <w:r>
+        <w:rPr>
+          <w:rFonts w:ascii="Arial" w:cs="Arial" w:eastAsia="Arial" w:hAnsi="Arial"/>
+        </w:rPr>
+        <w:t xml:space="preserve"> Box keeps earlier versions of the file (in Box on the web: the file's ⋯ menu → Version History).</w:t>
       </w:r>
     </w:p>
     <w:p>

</xml_diff>